<commit_message>
Add tests/verify-ad.sh: acceptance test against a real Active Directory
Non-destructive script for the broker node: prerequisites, broker keytab and
TGT flags/enctypes, a real S4U mint per user with kvno -U and -I (reports the
name AD puts in the tickets, encryption types, lifetimes, and whether the
2.3.0 cache checks accept them), optional UPN probe, Protected Users and
allow-list refusals, krb-credd --check, end-to-end krb-get / --status / web
service, and optionally the kill switch. Saves a PASS/FAIL report.

Dry-run against the MIT test KDC harness: 23/23 checks pass.
Runbook (doc + Word copy), README, CONTRIBUTING, CHANGELOG and the
line-by-line guide's test table updated.

Co-Authored-By: Claude Opus 5.5 <noreply@anthropic.com>
Claude-Session: https://claude.ai/code/session_012YjsSdZjahJs9G5kNGUV6m
</commit_message>
<xml_diff>
--- a/docs/hpc-test-lab-setup-runbook.docx
+++ b/docs/hpc-test-lab-setup-runbook.docx
@@ -7111,19 +7111,58 @@
         <w:pStyle w:val="Heading3"/>
       </w:pPr>
       <w:r>
-        <w:t xml:space="preserve">Tests that must succeed</w:t>
-      </w:r>
-    </w:p>
-    <w:p>
-      <w:pPr/>
-      <w:r>
-        <w:rPr>
-          <w:b/>
-        </w:rPr>
-        <w:t xml:space="preserve">1. Login gives the user tickets.</w:t>
-      </w:r>
-      <w:r>
-        <w:t xml:space="preserve"> From your workstation:</w:t>
+        <w:t xml:space="preserve">Automated acceptance test against your AD</w:t>
+      </w:r>
+    </w:p>
+    <w:p>
+      <w:pPr/>
+      <w:r>
+        <w:t xml:space="preserve">Run this first: </w:t>
+      </w:r>
+      <w:r>
+        <w:rPr>
+          <w:rStyle w:val="CodeChar"/>
+        </w:rPr>
+        <w:t xml:space="preserve">tests/verify-ad.sh</w:t>
+      </w:r>
+      <w:r>
+        <w:t xml:space="preserve"> automates the checks that only your real Active Directory can answer, and saves a PASS/FAIL report to </w:t>
+      </w:r>
+      <w:r>
+        <w:rPr>
+          <w:rStyle w:val="CodeChar"/>
+        </w:rPr>
+        <w:t xml:space="preserve">/var/tmp/krb-hpc-ad-test-&lt;timestamp&gt;.txt</w:t>
+      </w:r>
+      <w:r>
+        <w:t xml:space="preserve">. It is non-destructive: it reads </w:t>
+      </w:r>
+      <w:r>
+        <w:rPr>
+          <w:rStyle w:val="CodeChar"/>
+        </w:rPr>
+        <w:t xml:space="preserve">credd.conf</w:t>
+      </w:r>
+      <w:r>
+        <w:t xml:space="preserve">, works in a private temporary directory, and changes nothing in AD, </w:t>
+      </w:r>
+      <w:r>
+        <w:rPr>
+          <w:rStyle w:val="CodeChar"/>
+        </w:rPr>
+        <w:t xml:space="preserve">uidmap.conf</w:t>
+      </w:r>
+      <w:r>
+        <w:t xml:space="preserve"> or anyone's home (</w:t>
+      </w:r>
+      <w:r>
+        <w:rPr>
+          <w:rStyle w:val="CodeChar"/>
+        </w:rPr>
+        <w:t xml:space="preserve">--kill-switch</w:t>
+      </w:r>
+      <w:r>
+        <w:t xml:space="preserve"> stops issuance for a few seconds).</w:t>
       </w:r>
     </w:p>
     <w:p>
@@ -7133,31 +7172,61 @@
       <w:bookmarkStart w:id="49" w:name="bongo_lang_bash_49"/>
       <w:bookmarkEnd w:id="49"/>
       <w:r>
-        <w:t xml:space="preserve">ssh jdoe@hpclogin01.test.lab</w:t>
-        <w:br/>
-        <w:t xml:space="preserve">echo $KRB5CCNAME          # FILE:/home/jdoe/.krb5/krb5cc_hpc  (set by /etc/profile.d/krb-hpc.sh)</w:t>
-        <w:br/>
-        <w:t xml:space="preserve">klist</w:t>
-        <w:br/>
-        <w:t xml:space="preserve"># Ticket cache: FILE:/home/jdoe/.krb5/krb5cc_hpc</w:t>
-        <w:br/>
-        <w:t xml:space="preserve"># Default principal: jdoe@TEST.LAB</w:t>
-        <w:br/>
-        <w:t xml:space="preserve">#   ... HTTP/svc01.test.lab@TEST.LAB</w:t>
-        <w:br/>
-        <w:t xml:space="preserve">ls -la ~/.krb5            # drwx------ jdoe jdoe, and krb5cc_hpc is -rw------- jdoe jdoe</w:t>
-      </w:r>
-    </w:p>
-    <w:p>
-      <w:pPr/>
-      <w:r>
-        <w:t xml:space="preserve">There must be </w:t>
-      </w:r>
+        <w:t xml:space="preserve">cd /opt/krb-hpc</w:t>
+        <w:br/>
+        <w:t xml:space="preserve">sudo tests/verify-ad.sh --user jdoe --user asmith --refused ptest \</w:t>
+        <w:br/>
+        <w:t xml:space="preserve">     --url http://svc01.test.lab/whoami/ --kill-switch</w:t>
+        <w:br/>
+        <w:t xml:space="preserve"># optional: --upn jdoe=jdoe@test.lab   (check how AD names a user looked up by UPN)</w:t>
+      </w:r>
+    </w:p>
+    <w:p>
+      <w:pPr/>
+      <w:r>
+        <w:t xml:space="preserve">What it checks, in order:</w:t>
+      </w:r>
+    </w:p>
+    <w:p>
+      <w:pPr>
+        <w:pStyle w:val="ListParagraph"/>
+        <w:numPr>
+          <w:ilvl w:val="0"/>
+          <w:numId w:val="5"/>
+        </w:numPr>
+      </w:pPr>
       <w:r>
         <w:rPr>
           <w:b/>
         </w:rPr>
-        <w:t xml:space="preserve">no</w:t>
+        <w:t xml:space="preserve">This node:</w:t>
+      </w:r>
+      <w:r>
+        <w:t xml:space="preserve"> MIT 1.19+, the KDC reachable on port 88, the keytab root 0600 with an AES256 key for the broker (and its key version, to compare with </w:t>
+      </w:r>
+      <w:r>
+        <w:rPr>
+          <w:rStyle w:val="CodeChar"/>
+        </w:rPr>
+        <w:t xml:space="preserve">msDS-KeyVersionNumber</w:t>
+      </w:r>
+      <w:r>
+        <w:t xml:space="preserve">).</w:t>
+      </w:r>
+    </w:p>
+    <w:p>
+      <w:pPr>
+        <w:pStyle w:val="ListParagraph"/>
+        <w:numPr>
+          <w:ilvl w:val="0"/>
+          <w:numId w:val="5"/>
+        </w:numPr>
+      </w:pPr>
+      <w:r>
+        <w:rPr>
+          <w:b/>
+        </w:rPr>
+        <w:t xml:space="preserve">The broker's login:</w:t>
       </w:r>
       <w:r>
         <w:t xml:space="preserve"> </w:t>
@@ -7166,79 +7235,196 @@
         <w:rPr>
           <w:rStyle w:val="CodeChar"/>
         </w:rPr>
-        <w:t xml:space="preserve">krbtgt/TEST.LAB</w:t>
-      </w:r>
-      <w:r>
-        <w:t xml:space="preserve"> line: users get only service tickets to the allow-listed backends. To fetch again by hand at any time: </w:t>
-      </w:r>
-      <w:r>
-        <w:rPr>
-          <w:rStyle w:val="CodeChar"/>
-        </w:rPr>
-        <w:t xml:space="preserve">eval "$(krb-get)"</w:t>
-      </w:r>
-      <w:r>
-        <w:t xml:space="preserve">.</w:t>
-      </w:r>
-    </w:p>
-    <w:p>
-      <w:pPr/>
-      <w:r>
-        <w:t xml:space="preserve">Log in with </w:t>
-      </w:r>
-      <w:r>
-        <w:rPr>
-          <w:rStyle w:val="CodeChar"/>
-        </w:rPr>
-        <w:t xml:space="preserve">jdoe</w:t>
-      </w:r>
-      <w:r>
-        <w:t xml:space="preserve">'s AD password. Because the node is joined to AD, SSSD also obtains a login TGT in </w:t>
-      </w:r>
-      <w:r>
-        <w:rPr>
-          <w:rStyle w:val="CodeChar"/>
-        </w:rPr>
-        <w:t xml:space="preserve">/tmp/krb5cc_21001_*</w:t>
-      </w:r>
-      <w:r>
-        <w:t xml:space="preserve">; that cache stays on the login node and is not what jobs use. Check with </w:t>
-      </w:r>
-      <w:r>
-        <w:rPr>
-          <w:rStyle w:val="CodeChar"/>
-        </w:rPr>
-        <w:t xml:space="preserve">klist -l</w:t>
-      </w:r>
-      <w:r>
-        <w:t xml:space="preserve">: the </w:t>
-      </w:r>
-      <w:r>
-        <w:rPr>
-          <w:rStyle w:val="CodeChar"/>
-        </w:rPr>
-        <w:t xml:space="preserve">krb-credd</w:t>
-      </w:r>
-      <w:r>
-        <w:t xml:space="preserve"> cache (the one </w:t>
-      </w:r>
-      <w:r>
-        <w:rPr>
-          <w:rStyle w:val="CodeChar"/>
-        </w:rPr>
-        <w:t xml:space="preserve">KRB5CCNAME</w:t>
-      </w:r>
-      <w:r>
-        <w:t xml:space="preserve"> points at) holds only service tickets.</w:t>
-      </w:r>
-    </w:p>
-    <w:p>
-      <w:pPr/>
+        <w:t xml:space="preserve">kinit -k</w:t>
+      </w:r>
+      <w:r>
+        <w:t xml:space="preserve"> works, and the TGT is forwardable, renewable and AES.</w:t>
+      </w:r>
+    </w:p>
+    <w:p>
+      <w:pPr>
+        <w:pStyle w:val="ListParagraph"/>
+        <w:numPr>
+          <w:ilvl w:val="0"/>
+          <w:numId w:val="5"/>
+        </w:numPr>
+      </w:pPr>
       <w:r>
         <w:rPr>
           <w:b/>
         </w:rPr>
-        <w:t xml:space="preserve">2. The login node can use the service.</w:t>
+        <w:t xml:space="preserve">Delegation per user:</w:t>
+      </w:r>
+      <w:r>
+        <w:t xml:space="preserve"> a real S4U mint with both </w:t>
+      </w:r>
+      <w:r>
+        <w:rPr>
+          <w:rStyle w:val="CodeChar"/>
+        </w:rPr>
+        <w:t xml:space="preserve">kvno -U</w:t>
+      </w:r>
+      <w:r>
+        <w:t xml:space="preserve"> and </w:t>
+      </w:r>
+      <w:r>
+        <w:rPr>
+          <w:rStyle w:val="CodeChar"/>
+        </w:rPr>
+        <w:t xml:space="preserve">-I</w:t>
+      </w:r>
+      <w:r>
+        <w:t xml:space="preserve">. It reports the exact name AD puts in the tickets, each ticket's encryption types and lifetime, and whether the daemon's 2.3.0 checks accept the result.</w:t>
+      </w:r>
+    </w:p>
+    <w:p>
+      <w:pPr>
+        <w:pStyle w:val="ListParagraph"/>
+        <w:numPr>
+          <w:ilvl w:val="0"/>
+          <w:numId w:val="5"/>
+        </w:numPr>
+      </w:pPr>
+      <w:r>
+        <w:rPr>
+          <w:b/>
+        </w:rPr>
+        <w:t xml:space="preserve">Refusals:</w:t>
+      </w:r>
+      <w:r>
+        <w:t xml:space="preserve"> the Protected Users account is refused, and an SPN not in </w:t>
+      </w:r>
+      <w:r>
+        <w:rPr>
+          <w:rStyle w:val="CodeChar"/>
+        </w:rPr>
+        <w:t xml:space="preserve">msDS-AllowedToDelegateTo</w:t>
+      </w:r>
+      <w:r>
+        <w:t xml:space="preserve"> (by default </w:t>
+      </w:r>
+      <w:r>
+        <w:rPr>
+          <w:rStyle w:val="CodeChar"/>
+        </w:rPr>
+        <w:t xml:space="preserve">host/&lt;your DC&gt;</w:t>
+      </w:r>
+      <w:r>
+        <w:t xml:space="preserve">) is refused.</w:t>
+      </w:r>
+    </w:p>
+    <w:p>
+      <w:pPr>
+        <w:pStyle w:val="ListParagraph"/>
+        <w:numPr>
+          <w:ilvl w:val="0"/>
+          <w:numId w:val="5"/>
+        </w:numPr>
+      </w:pPr>
+      <w:r>
+        <w:rPr>
+          <w:rStyle w:val="CodeChar"/>
+          <w:b/>
+        </w:rPr>
+        <w:t xml:space="preserve">krb-credd --check</w:t>
+      </w:r>
+      <w:r>
+        <w:t xml:space="preserve"> for a good and a refused user.</w:t>
+      </w:r>
+    </w:p>
+    <w:p>
+      <w:pPr>
+        <w:pStyle w:val="ListParagraph"/>
+        <w:numPr>
+          <w:ilvl w:val="0"/>
+          <w:numId w:val="5"/>
+        </w:numPr>
+      </w:pPr>
+      <w:r>
+        <w:rPr>
+          <w:b/>
+        </w:rPr>
+        <w:t xml:space="preserve">End to end through the running daemon:</w:t>
+      </w:r>
+      <w:r>
+        <w:t xml:space="preserve"> </w:t>
+      </w:r>
+      <w:r>
+        <w:rPr>
+          <w:rStyle w:val="CodeChar"/>
+        </w:rPr>
+        <w:t xml:space="preserve">krb-get</w:t>
+      </w:r>
+      <w:r>
+        <w:t xml:space="preserve">, cache ownership and mode, no TGT, </w:t>
+      </w:r>
+      <w:r>
+        <w:rPr>
+          <w:rStyle w:val="CodeChar"/>
+        </w:rPr>
+        <w:t xml:space="preserve">krb-get --status</w:t>
+      </w:r>
+      <w:r>
+        <w:t xml:space="preserve">, the web service accepting the ticket, the refused user's message.</w:t>
+      </w:r>
+    </w:p>
+    <w:p>
+      <w:pPr>
+        <w:pStyle w:val="ListParagraph"/>
+        <w:numPr>
+          <w:ilvl w:val="0"/>
+          <w:numId w:val="5"/>
+        </w:numPr>
+      </w:pPr>
+      <w:r>
+        <w:rPr>
+          <w:b/>
+        </w:rPr>
+        <w:t xml:space="preserve">Kill switch</w:t>
+      </w:r>
+      <w:r>
+        <w:t xml:space="preserve"> (with </w:t>
+      </w:r>
+      <w:r>
+        <w:rPr>
+          <w:rStyle w:val="CodeChar"/>
+        </w:rPr>
+        <w:t xml:space="preserve">--kill-switch</w:t>
+      </w:r>
+      <w:r>
+        <w:t xml:space="preserve">): refuses at once, and service resumes.</w:t>
+      </w:r>
+    </w:p>
+    <w:p>
+      <w:pPr/>
+      <w:r>
+        <w:t xml:space="preserve">The script was dry-run against the MIT test KDC used by the repository's own tests (23 of 23 checks pass there). Your AD is the real test: send me the report if anything fails or warns.</w:t>
+      </w:r>
+    </w:p>
+    <w:p>
+      <w:pPr/>
+      <w:r>
+        <w:t xml:space="preserve">The numbered tests below explain each behaviour and can be run by hand.</w:t>
+      </w:r>
+    </w:p>
+    <w:p>
+      <w:pPr>
+        <w:pStyle w:val="Heading3"/>
+      </w:pPr>
+      <w:r>
+        <w:t xml:space="preserve">Tests that must succeed</w:t>
+      </w:r>
+    </w:p>
+    <w:p>
+      <w:pPr/>
+      <w:r>
+        <w:rPr>
+          <w:b/>
+        </w:rPr>
+        <w:t xml:space="preserve">1. Login gives the user tickets.</w:t>
+      </w:r>
+      <w:r>
+        <w:t xml:space="preserve"> From your workstation:</w:t>
       </w:r>
     </w:p>
     <w:p>
@@ -7248,16 +7434,112 @@
       <w:bookmarkStart w:id="50" w:name="bongo_lang_bash_50"/>
       <w:bookmarkEnd w:id="50"/>
       <w:r>
-        <w:t xml:space="preserve">curl -s --negotiate -u : http://svc01.test.lab/whoami/     # jdoe@TEST.LAB</w:t>
-      </w:r>
-    </w:p>
-    <w:p>
-      <w:pPr/>
+        <w:t xml:space="preserve">ssh jdoe@hpclogin01.test.lab</w:t>
+        <w:br/>
+        <w:t xml:space="preserve">echo $KRB5CCNAME          # FILE:/home/jdoe/.krb5/krb5cc_hpc  (set by /etc/profile.d/krb-hpc.sh)</w:t>
+        <w:br/>
+        <w:t xml:space="preserve">klist</w:t>
+        <w:br/>
+        <w:t xml:space="preserve"># Ticket cache: FILE:/home/jdoe/.krb5/krb5cc_hpc</w:t>
+        <w:br/>
+        <w:t xml:space="preserve"># Default principal: jdoe@TEST.LAB</w:t>
+        <w:br/>
+        <w:t xml:space="preserve">#   ... HTTP/svc01.test.lab@TEST.LAB</w:t>
+        <w:br/>
+        <w:t xml:space="preserve">ls -la ~/.krb5            # drwx------ jdoe jdoe, and krb5cc_hpc is -rw------- jdoe jdoe</w:t>
+      </w:r>
+    </w:p>
+    <w:p>
+      <w:pPr/>
+      <w:r>
+        <w:t xml:space="preserve">There must be </w:t>
+      </w:r>
       <w:r>
         <w:rPr>
           <w:b/>
         </w:rPr>
-        <w:t xml:space="preserve">3. Jobs on both compute nodes use the same ticket.</w:t>
+        <w:t xml:space="preserve">no</w:t>
+      </w:r>
+      <w:r>
+        <w:t xml:space="preserve"> </w:t>
+      </w:r>
+      <w:r>
+        <w:rPr>
+          <w:rStyle w:val="CodeChar"/>
+        </w:rPr>
+        <w:t xml:space="preserve">krbtgt/TEST.LAB</w:t>
+      </w:r>
+      <w:r>
+        <w:t xml:space="preserve"> line: users get only service tickets to the allow-listed backends. To fetch again by hand at any time: </w:t>
+      </w:r>
+      <w:r>
+        <w:rPr>
+          <w:rStyle w:val="CodeChar"/>
+        </w:rPr>
+        <w:t xml:space="preserve">eval "$(krb-get)"</w:t>
+      </w:r>
+      <w:r>
+        <w:t xml:space="preserve">.</w:t>
+      </w:r>
+    </w:p>
+    <w:p>
+      <w:pPr/>
+      <w:r>
+        <w:t xml:space="preserve">Log in with </w:t>
+      </w:r>
+      <w:r>
+        <w:rPr>
+          <w:rStyle w:val="CodeChar"/>
+        </w:rPr>
+        <w:t xml:space="preserve">jdoe</w:t>
+      </w:r>
+      <w:r>
+        <w:t xml:space="preserve">'s AD password. Because the node is joined to AD, SSSD also obtains a login TGT in </w:t>
+      </w:r>
+      <w:r>
+        <w:rPr>
+          <w:rStyle w:val="CodeChar"/>
+        </w:rPr>
+        <w:t xml:space="preserve">/tmp/krb5cc_21001_*</w:t>
+      </w:r>
+      <w:r>
+        <w:t xml:space="preserve">; that cache stays on the login node and is not what jobs use. Check with </w:t>
+      </w:r>
+      <w:r>
+        <w:rPr>
+          <w:rStyle w:val="CodeChar"/>
+        </w:rPr>
+        <w:t xml:space="preserve">klist -l</w:t>
+      </w:r>
+      <w:r>
+        <w:t xml:space="preserve">: the </w:t>
+      </w:r>
+      <w:r>
+        <w:rPr>
+          <w:rStyle w:val="CodeChar"/>
+        </w:rPr>
+        <w:t xml:space="preserve">krb-credd</w:t>
+      </w:r>
+      <w:r>
+        <w:t xml:space="preserve"> cache (the one </w:t>
+      </w:r>
+      <w:r>
+        <w:rPr>
+          <w:rStyle w:val="CodeChar"/>
+        </w:rPr>
+        <w:t xml:space="preserve">KRB5CCNAME</w:t>
+      </w:r>
+      <w:r>
+        <w:t xml:space="preserve"> points at) holds only service tickets.</w:t>
+      </w:r>
+    </w:p>
+    <w:p>
+      <w:pPr/>
+      <w:r>
+        <w:rPr>
+          <w:b/>
+        </w:rPr>
+        <w:t xml:space="preserve">2. The login node can use the service.</w:t>
       </w:r>
     </w:p>
     <w:p>
@@ -7267,15 +7549,7 @@
       <w:bookmarkStart w:id="51" w:name="bongo_lang_bash_51"/>
       <w:bookmarkEnd w:id="51"/>
       <w:r>
-        <w:t xml:space="preserve">srun -N2 bash -c 'echo "$(hostname -s): $KRB5CCNAME"; curl -s --negotiate -u : http://svc01.test.lab/whoami/'</w:t>
-        <w:br/>
-        <w:t xml:space="preserve"># cn01: FILE:/home/jdoe/.krb5/krb5cc_hpc</w:t>
-        <w:br/>
-        <w:t xml:space="preserve"># jdoe@TEST.LAB</w:t>
-        <w:br/>
-        <w:t xml:space="preserve"># cn02: FILE:/home/jdoe/.krb5/krb5cc_hpc</w:t>
-        <w:br/>
-        <w:t xml:space="preserve"># jdoe@TEST.LAB</w:t>
+        <w:t xml:space="preserve">curl -s --negotiate -u : http://svc01.test.lab/whoami/     # jdoe@TEST.LAB</w:t>
       </w:r>
     </w:p>
     <w:p>
@@ -7284,7 +7558,7 @@
         <w:rPr>
           <w:b/>
         </w:rPr>
-        <w:t xml:space="preserve">4. Batch jobs work, including with a clean environment.</w:t>
+        <w:t xml:space="preserve">3. Jobs on both compute nodes use the same ticket.</w:t>
       </w:r>
     </w:p>
     <w:p>
@@ -7294,64 +7568,15 @@
       <w:bookmarkStart w:id="52" w:name="bongo_lang_bash_52"/>
       <w:bookmarkEnd w:id="52"/>
       <w:r>
-        <w:t xml:space="preserve">cat &gt; ~/krbtest.sbatch &lt;&lt;'EOF'</w:t>
-        <w:br/>
-        <w:t xml:space="preserve">#!/bin/bash</w:t>
-        <w:br/>
-        <w:t xml:space="preserve">#SBATCH -N 2 -o krbtest-%j.out</w:t>
-        <w:br/>
-        <w:t xml:space="preserve">srun bash -c 'hostname -s; klist | sed -n 2p; curl -s --negotiate -u : http://svc01.test.lab/whoami/'</w:t>
-        <w:br/>
-        <w:t xml:space="preserve">EOF</w:t>
-        <w:br/>
-        <w:t xml:space="preserve">sbatch ~/krbtest.sbatch</w:t>
-        <w:br/>
-        <w:t xml:space="preserve">sbatch --export=NONE ~/krbtest.sbatch      # HOME unset: the TaskProlog falls back to passwd</w:t>
-        <w:br/>
-        <w:t xml:space="preserve"># after they finish:</w:t>
-        <w:br/>
-        <w:t xml:space="preserve">cat krbtest-*.out                           # each shows "Default principal: jdoe@TEST.LAB" and jdoe@TEST.LAB</w:t>
-      </w:r>
-    </w:p>
-    <w:p>
-      <w:pPr/>
-      <w:r>
-        <w:t xml:space="preserve">On </w:t>
-      </w:r>
-      <w:r>
-        <w:rPr>
-          <w:rStyle w:val="CodeChar"/>
-        </w:rPr>
-        <w:t xml:space="preserve">svc01</w:t>
-      </w:r>
-      <w:r>
-        <w:t xml:space="preserve">, </w:t>
-      </w:r>
-      <w:r>
-        <w:rPr>
-          <w:rStyle w:val="CodeChar"/>
-        </w:rPr>
-        <w:t xml:space="preserve">sudo tail /var/log/httpd/access_log</w:t>
-      </w:r>
-      <w:r>
-        <w:t xml:space="preserve"> shows requests from 10.10.0.21, .31 and .32, each with user </w:t>
-      </w:r>
-      <w:r>
-        <w:rPr>
-          <w:rStyle w:val="CodeChar"/>
-        </w:rPr>
-        <w:t xml:space="preserve">jdoe@TEST.LAB</w:t>
-      </w:r>
-      <w:r>
-        <w:t xml:space="preserve">.</w:t>
-      </w:r>
-    </w:p>
-    <w:p>
-      <w:pPr>
-        <w:pStyle w:val="Heading3"/>
-      </w:pPr>
-      <w:r>
-        <w:t xml:space="preserve">Tests that must be refused</w:t>
+        <w:t xml:space="preserve">srun -N2 bash -c 'echo "$(hostname -s): $KRB5CCNAME"; curl -s --negotiate -u : http://svc01.test.lab/whoami/'</w:t>
+        <w:br/>
+        <w:t xml:space="preserve"># cn01: FILE:/home/jdoe/.krb5/krb5cc_hpc</w:t>
+        <w:br/>
+        <w:t xml:space="preserve"># jdoe@TEST.LAB</w:t>
+        <w:br/>
+        <w:t xml:space="preserve"># cn02: FILE:/home/jdoe/.krb5/krb5cc_hpc</w:t>
+        <w:br/>
+        <w:t xml:space="preserve"># jdoe@TEST.LAB</w:t>
       </w:r>
     </w:p>
     <w:p>
@@ -7360,7 +7585,7 @@
         <w:rPr>
           <w:b/>
         </w:rPr>
-        <w:t xml:space="preserve">5. A non-delegable account gets nothing, with a clear message.</w:t>
+        <w:t xml:space="preserve">4. Batch jobs work, including with a clean environment.</w:t>
       </w:r>
     </w:p>
     <w:p>
@@ -7370,48 +7595,73 @@
       <w:bookmarkStart w:id="53" w:name="bongo_lang_bash_53"/>
       <w:bookmarkEnd w:id="53"/>
       <w:r>
-        <w:t xml:space="preserve">ssh ptest@hpclogin01.test.lab</w:t>
-        <w:br/>
-        <w:t xml:space="preserve">krb-get; echo "exit $?"</w:t>
-        <w:br/>
-        <w:t xml:space="preserve"># krb-get: your account cannot be delegated to the HPC services; contact the HPC admins</w:t>
-        <w:br/>
-        <w:t xml:space="preserve"># exit 1</w:t>
-        <w:br/>
-        <w:t xml:space="preserve">srun -N1 true    # job output: krb-hpc: no Kerberos tickets in /home/ptest/.krb5/krb5cc_hpc (...)</w:t>
-      </w:r>
-    </w:p>
-    <w:p>
-      <w:pPr/>
-      <w:r>
-        <w:t xml:space="preserve">The daemon's log (</w:t>
-      </w:r>
-      <w:r>
-        <w:rPr>
-          <w:rStyle w:val="CodeChar"/>
-        </w:rPr>
-        <w:t xml:space="preserve">journalctl -u krb-credd</w:t>
-      </w:r>
-      <w:r>
-        <w:t xml:space="preserve">) has the full KDC error with category </w:t>
-      </w:r>
-      <w:r>
-        <w:rPr>
-          <w:rStyle w:val="CodeChar"/>
-        </w:rPr>
-        <w:t xml:space="preserve">[not_delegable]</w:t>
+        <w:t xml:space="preserve">cat &gt; ~/krbtest.sbatch &lt;&lt;'EOF'</w:t>
+        <w:br/>
+        <w:t xml:space="preserve">#!/bin/bash</w:t>
+        <w:br/>
+        <w:t xml:space="preserve">#SBATCH -N 2 -o krbtest-%j.out</w:t>
+        <w:br/>
+        <w:t xml:space="preserve">srun bash -c 'hostname -s; klist | sed -n 2p; curl -s --negotiate -u : http://svc01.test.lab/whoami/'</w:t>
+        <w:br/>
+        <w:t xml:space="preserve">EOF</w:t>
+        <w:br/>
+        <w:t xml:space="preserve">sbatch ~/krbtest.sbatch</w:t>
+        <w:br/>
+        <w:t xml:space="preserve">sbatch --export=NONE ~/krbtest.sbatch      # HOME unset: the TaskProlog falls back to passwd</w:t>
+        <w:br/>
+        <w:t xml:space="preserve"># after they finish:</w:t>
+        <w:br/>
+        <w:t xml:space="preserve">cat krbtest-*.out                           # each shows "Default principal: jdoe@TEST.LAB" and jdoe@TEST.LAB</w:t>
+      </w:r>
+    </w:p>
+    <w:p>
+      <w:pPr/>
+      <w:r>
+        <w:t xml:space="preserve">On </w:t>
+      </w:r>
+      <w:r>
+        <w:rPr>
+          <w:rStyle w:val="CodeChar"/>
+        </w:rPr>
+        <w:t xml:space="preserve">svc01</w:t>
+      </w:r>
+      <w:r>
+        <w:t xml:space="preserve">, </w:t>
+      </w:r>
+      <w:r>
+        <w:rPr>
+          <w:rStyle w:val="CodeChar"/>
+        </w:rPr>
+        <w:t xml:space="preserve">sudo tail /var/log/httpd/access_log</w:t>
+      </w:r>
+      <w:r>
+        <w:t xml:space="preserve"> shows requests from 10.10.0.21, .31 and .32, each with user </w:t>
+      </w:r>
+      <w:r>
+        <w:rPr>
+          <w:rStyle w:val="CodeChar"/>
+        </w:rPr>
+        <w:t xml:space="preserve">jdoe@TEST.LAB</w:t>
       </w:r>
       <w:r>
         <w:t xml:space="preserve">.</w:t>
       </w:r>
     </w:p>
     <w:p>
+      <w:pPr>
+        <w:pStyle w:val="Heading3"/>
+      </w:pPr>
+      <w:r>
+        <w:t xml:space="preserve">Tests that must be refused</w:t>
+      </w:r>
+    </w:p>
+    <w:p>
       <w:pPr/>
       <w:r>
         <w:rPr>
           <w:b/>
         </w:rPr>
-        <w:t xml:space="preserve">6. An un-enrolled user is refused.</w:t>
+        <w:t xml:space="preserve">5. A non-delegable account gets nothing, with a clear message.</w:t>
       </w:r>
     </w:p>
     <w:p>
@@ -7421,15 +7671,39 @@
       <w:bookmarkStart w:id="54" w:name="bongo_lang_bash_54"/>
       <w:bookmarkEnd w:id="54"/>
       <w:r>
-        <w:t xml:space="preserve">sudo /opt/krb-hpc/admin/revoke_user.sh asmith</w:t>
-        <w:br/>
-        <w:t xml:space="preserve">ssh asmith@hpclogin01.test.lab 'krb-get; echo "exit $?"'</w:t>
-        <w:br/>
-        <w:t xml:space="preserve"># krb-get: uid 21003 is not enrolled</w:t>
+        <w:t xml:space="preserve">ssh ptest@hpclogin01.test.lab</w:t>
+        <w:br/>
+        <w:t xml:space="preserve">krb-get; echo "exit $?"</w:t>
+        <w:br/>
+        <w:t xml:space="preserve"># krb-get: your account cannot be delegated to the HPC services; contact the HPC admins</w:t>
         <w:br/>
         <w:t xml:space="preserve"># exit 1</w:t>
         <w:br/>
-        <w:t xml:space="preserve">sudo /opt/krb-hpc/admin/enroll_user.sh asmith           # put asmith back</w:t>
+        <w:t xml:space="preserve">srun -N1 true    # job output: krb-hpc: no Kerberos tickets in /home/ptest/.krb5/krb5cc_hpc (...)</w:t>
+      </w:r>
+    </w:p>
+    <w:p>
+      <w:pPr/>
+      <w:r>
+        <w:t xml:space="preserve">The daemon's log (</w:t>
+      </w:r>
+      <w:r>
+        <w:rPr>
+          <w:rStyle w:val="CodeChar"/>
+        </w:rPr>
+        <w:t xml:space="preserve">journalctl -u krb-credd</w:t>
+      </w:r>
+      <w:r>
+        <w:t xml:space="preserve">) has the full KDC error with category </w:t>
+      </w:r>
+      <w:r>
+        <w:rPr>
+          <w:rStyle w:val="CodeChar"/>
+        </w:rPr>
+        <w:t xml:space="preserve">[not_delegable]</w:t>
+      </w:r>
+      <w:r>
+        <w:t xml:space="preserve">.</w:t>
       </w:r>
     </w:p>
     <w:p>
@@ -7438,19 +7712,7 @@
         <w:rPr>
           <w:b/>
         </w:rPr>
-        <w:t xml:space="preserve">7. One user cannot read another's tickets.</w:t>
-      </w:r>
-      <w:r>
-        <w:t xml:space="preserve"> As </w:t>
-      </w:r>
-      <w:r>
-        <w:rPr>
-          <w:rStyle w:val="CodeChar"/>
-        </w:rPr>
-        <w:t xml:space="preserve">asmith</w:t>
-      </w:r>
-      <w:r>
-        <w:t xml:space="preserve">:</w:t>
+        <w:t xml:space="preserve">6. An un-enrolled user is refused.</w:t>
       </w:r>
     </w:p>
     <w:p>
@@ -7460,7 +7722,15 @@
       <w:bookmarkStart w:id="55" w:name="bongo_lang_bash_55"/>
       <w:bookmarkEnd w:id="55"/>
       <w:r>
-        <w:t xml:space="preserve">KRB5CCNAME=FILE:/home/jdoe/.krb5/krb5cc_hpc klist   # fails: Permission denied (home is 0700)</w:t>
+        <w:t xml:space="preserve">sudo /opt/krb-hpc/admin/revoke_user.sh asmith</w:t>
+        <w:br/>
+        <w:t xml:space="preserve">ssh asmith@hpclogin01.test.lab 'krb-get; echo "exit $?"'</w:t>
+        <w:br/>
+        <w:t xml:space="preserve"># krb-get: uid 21003 is not enrolled</w:t>
+        <w:br/>
+        <w:t xml:space="preserve"># exit 1</w:t>
+        <w:br/>
+        <w:t xml:space="preserve">sudo /opt/krb-hpc/admin/enroll_user.sh asmith           # put asmith back</w:t>
       </w:r>
     </w:p>
     <w:p>
@@ -7469,7 +7739,7 @@
         <w:rPr>
           <w:b/>
         </w:rPr>
-        <w:t xml:space="preserve">8. Nothing outside the allow-list can be obtained.</w:t>
+        <w:t xml:space="preserve">7. One user cannot read another's tickets.</w:t>
       </w:r>
       <w:r>
         <w:t xml:space="preserve"> As </w:t>
@@ -7478,7 +7748,7 @@
         <w:rPr>
           <w:rStyle w:val="CodeChar"/>
         </w:rPr>
-        <w:t xml:space="preserve">jdoe</w:t>
+        <w:t xml:space="preserve">asmith</w:t>
       </w:r>
       <w:r>
         <w:t xml:space="preserve">:</w:t>
@@ -7491,15 +7761,7 @@
       <w:bookmarkStart w:id="56" w:name="bongo_lang_bash_56"/>
       <w:bookmarkEnd w:id="56"/>
       <w:r>
-        <w:t xml:space="preserve">kvno HTTP/dc01.test.lab@TEST.LAB    # fails: no TGT in the cache, so no new tickets of any kind</w:t>
-      </w:r>
-    </w:p>
-    <w:p>
-      <w:pPr>
-        <w:pStyle w:val="Heading3"/>
-      </w:pPr>
-      <w:r>
-        <w:t xml:space="preserve">Tests that prove unattended operation</w:t>
+        <w:t xml:space="preserve">KRB5CCNAME=FILE:/home/jdoe/.krb5/krb5cc_hpc klist   # fails: Permission denied (home is 0700)</w:t>
       </w:r>
     </w:p>
     <w:p>
@@ -7508,19 +7770,10 @@
         <w:rPr>
           <w:b/>
         </w:rPr>
-        <w:t xml:space="preserve">9. A deleted cache comes back by itself.</w:t>
-      </w:r>
-      <w:r>
-        <w:t xml:space="preserve"> With a job running (</w:t>
-      </w:r>
-      <w:r>
-        <w:rPr>
-          <w:rStyle w:val="CodeChar"/>
-        </w:rPr>
-        <w:t xml:space="preserve">sbatch --wrap 'sleep 900'</w:t>
-      </w:r>
-      <w:r>
-        <w:t xml:space="preserve"> as </w:t>
+        <w:t xml:space="preserve">8. Nothing outside the allow-list can be obtained.</w:t>
+      </w:r>
+      <w:r>
+        <w:t xml:space="preserve"> As </w:t>
       </w:r>
       <w:r>
         <w:rPr>
@@ -7529,16 +7782,7 @@
         <w:t xml:space="preserve">jdoe</w:t>
       </w:r>
       <w:r>
-        <w:t xml:space="preserve">), or within 7 days of </w:t>
-      </w:r>
-      <w:r>
-        <w:rPr>
-          <w:rStyle w:val="CodeChar"/>
-        </w:rPr>
-        <w:t xml:space="preserve">jdoe</w:t>
-      </w:r>
-      <w:r>
-        <w:t xml:space="preserve">'s last login:</w:t>
+        <w:t xml:space="preserve">:</w:t>
       </w:r>
     </w:p>
     <w:p>
@@ -7548,11 +7792,15 @@
       <w:bookmarkStart w:id="57" w:name="bongo_lang_bash_57"/>
       <w:bookmarkEnd w:id="57"/>
       <w:r>
-        <w:t xml:space="preserve">rm ~/.krb5/krb5cc_hpc</w:t>
-        <w:br/>
-        <w:t xml:space="preserve"># wait up to refresh_interval (5 minutes), then:</w:t>
-        <w:br/>
-        <w:t xml:space="preserve">klist | head -2         # the cache is back</w:t>
+        <w:t xml:space="preserve">kvno HTTP/dc01.test.lab@TEST.LAB    # fails: no TGT in the cache, so no new tickets of any kind</w:t>
+      </w:r>
+    </w:p>
+    <w:p>
+      <w:pPr>
+        <w:pStyle w:val="Heading3"/>
+      </w:pPr>
+      <w:r>
+        <w:t xml:space="preserve">Tests that prove unattended operation</w:t>
       </w:r>
     </w:p>
     <w:p>
@@ -7561,7 +7809,37 @@
         <w:rPr>
           <w:b/>
         </w:rPr>
-        <w:t xml:space="preserve">10. Restarts and renewal.</w:t>
+        <w:t xml:space="preserve">9. A deleted cache comes back by itself.</w:t>
+      </w:r>
+      <w:r>
+        <w:t xml:space="preserve"> With a job running (</w:t>
+      </w:r>
+      <w:r>
+        <w:rPr>
+          <w:rStyle w:val="CodeChar"/>
+        </w:rPr>
+        <w:t xml:space="preserve">sbatch --wrap 'sleep 900'</w:t>
+      </w:r>
+      <w:r>
+        <w:t xml:space="preserve"> as </w:t>
+      </w:r>
+      <w:r>
+        <w:rPr>
+          <w:rStyle w:val="CodeChar"/>
+        </w:rPr>
+        <w:t xml:space="preserve">jdoe</w:t>
+      </w:r>
+      <w:r>
+        <w:t xml:space="preserve">), or within 7 days of </w:t>
+      </w:r>
+      <w:r>
+        <w:rPr>
+          <w:rStyle w:val="CodeChar"/>
+        </w:rPr>
+        <w:t xml:space="preserve">jdoe</w:t>
+      </w:r>
+      <w:r>
+        <w:t xml:space="preserve">'s last login:</w:t>
       </w:r>
     </w:p>
     <w:p>
@@ -7571,88 +7849,11 @@
       <w:bookmarkStart w:id="58" w:name="bongo_lang_bash_58"/>
       <w:bookmarkEnd w:id="58"/>
       <w:r>
-        <w:t xml:space="preserve">sudo systemctl restart krb-credd</w:t>
-        <w:br/>
-        <w:t xml:space="preserve">sudo journalctl -u krb-credd -n 10 --no-pager   # "resuming refresh for N previously active user(s)"</w:t>
-        <w:br/>
-        <w:t xml:space="preserve">sudo klist -c FILE:/var/lib/krb-hpc/broker.cc   # only the broker's krbtgt, never users' tickets</w:t>
-      </w:r>
-    </w:p>
-    <w:p>
-      <w:pPr/>
-      <w:r>
-        <w:t xml:space="preserve">To watch re-minting happen quickly, set </w:t>
-      </w:r>
-      <w:r>
-        <w:rPr>
-          <w:rStyle w:val="CodeChar"/>
-        </w:rPr>
-        <w:t xml:space="preserve">renew_margin = 590m</w:t>
-      </w:r>
-      <w:r>
-        <w:t xml:space="preserve"> and </w:t>
-      </w:r>
-      <w:r>
-        <w:rPr>
-          <w:rStyle w:val="CodeChar"/>
-        </w:rPr>
-        <w:t xml:space="preserve">refresh_interval = 1m</w:t>
-      </w:r>
-      <w:r>
-        <w:t xml:space="preserve"> in </w:t>
-      </w:r>
-      <w:r>
-        <w:rPr>
-          <w:rStyle w:val="CodeChar"/>
-        </w:rPr>
-        <w:t xml:space="preserve">credd.conf</w:t>
-      </w:r>
-      <w:r>
-        <w:t xml:space="preserve">, restart, and run </w:t>
-      </w:r>
-      <w:r>
-        <w:rPr>
-          <w:rStyle w:val="CodeChar"/>
-        </w:rPr>
-        <w:t xml:space="preserve">klist</w:t>
-      </w:r>
-      <w:r>
-        <w:t xml:space="preserve"> in </w:t>
-      </w:r>
-      <w:r>
-        <w:rPr>
-          <w:rStyle w:val="CodeChar"/>
-        </w:rPr>
-        <w:t xml:space="preserve">jdoe</w:t>
-      </w:r>
-      <w:r>
-        <w:t xml:space="preserve">'s session every minute: the expiry time moves forward on each pass. Put the values back to </w:t>
-      </w:r>
-      <w:r>
-        <w:rPr>
-          <w:rStyle w:val="CodeChar"/>
-        </w:rPr>
-        <w:t xml:space="preserve">1h</w:t>
-      </w:r>
-      <w:r>
-        <w:t xml:space="preserve"> and </w:t>
-      </w:r>
-      <w:r>
-        <w:rPr>
-          <w:rStyle w:val="CodeChar"/>
-        </w:rPr>
-        <w:t xml:space="preserve">5m</w:t>
-      </w:r>
-      <w:r>
-        <w:t xml:space="preserve"> afterwards.</w:t>
-      </w:r>
-    </w:p>
-    <w:p>
-      <w:pPr>
-        <w:pStyle w:val="Heading3"/>
-      </w:pPr>
-      <w:r>
-        <w:t xml:space="preserve">Tests of the safety controls (2.3.0)</w:t>
+        <w:t xml:space="preserve">rm ~/.krb5/krb5cc_hpc</w:t>
+        <w:br/>
+        <w:t xml:space="preserve"># wait up to refresh_interval (5 minutes), then:</w:t>
+        <w:br/>
+        <w:t xml:space="preserve">klist | head -2         # the cache is back</w:t>
       </w:r>
     </w:p>
     <w:p>
@@ -7661,7 +7862,7 @@
         <w:rPr>
           <w:b/>
         </w:rPr>
-        <w:t xml:space="preserve">11. Users can see their own status.</w:t>
+        <w:t xml:space="preserve">10. Restarts and renewal.</w:t>
       </w:r>
     </w:p>
     <w:p>
@@ -7671,19 +7872,88 @@
       <w:bookmarkStart w:id="59" w:name="bongo_lang_bash_59"/>
       <w:bookmarkEnd w:id="59"/>
       <w:r>
-        <w:t xml:space="preserve">krb-get --status                                 # as jdoe</w:t>
-        <w:br/>
-        <w:t xml:space="preserve"># enrolled:        True</w:t>
-        <w:br/>
-        <w:t xml:space="preserve"># tickets expire:  2026-10-11 07:02 (in 9h41m)</w:t>
-        <w:br/>
-        <w:t xml:space="preserve">ssh ptest@hpclogin01.test.lab 'krb-get --status'</w:t>
-        <w:br/>
-        <w:t xml:space="preserve"># enrolled:        True</w:t>
-        <w:br/>
-        <w:t xml:space="preserve"># tickets expire:  -</w:t>
-        <w:br/>
-        <w:t xml:space="preserve"># last error:      your account cannot be delegated to the HPC services; contact the HPC admins (at ...)</w:t>
+        <w:t xml:space="preserve">sudo systemctl restart krb-credd</w:t>
+        <w:br/>
+        <w:t xml:space="preserve">sudo journalctl -u krb-credd -n 10 --no-pager   # "resuming refresh for N previously active user(s)"</w:t>
+        <w:br/>
+        <w:t xml:space="preserve">sudo klist -c FILE:/var/lib/krb-hpc/broker.cc   # only the broker's krbtgt, never users' tickets</w:t>
+      </w:r>
+    </w:p>
+    <w:p>
+      <w:pPr/>
+      <w:r>
+        <w:t xml:space="preserve">To watch re-minting happen quickly, set </w:t>
+      </w:r>
+      <w:r>
+        <w:rPr>
+          <w:rStyle w:val="CodeChar"/>
+        </w:rPr>
+        <w:t xml:space="preserve">renew_margin = 590m</w:t>
+      </w:r>
+      <w:r>
+        <w:t xml:space="preserve"> and </w:t>
+      </w:r>
+      <w:r>
+        <w:rPr>
+          <w:rStyle w:val="CodeChar"/>
+        </w:rPr>
+        <w:t xml:space="preserve">refresh_interval = 1m</w:t>
+      </w:r>
+      <w:r>
+        <w:t xml:space="preserve"> in </w:t>
+      </w:r>
+      <w:r>
+        <w:rPr>
+          <w:rStyle w:val="CodeChar"/>
+        </w:rPr>
+        <w:t xml:space="preserve">credd.conf</w:t>
+      </w:r>
+      <w:r>
+        <w:t xml:space="preserve">, restart, and run </w:t>
+      </w:r>
+      <w:r>
+        <w:rPr>
+          <w:rStyle w:val="CodeChar"/>
+        </w:rPr>
+        <w:t xml:space="preserve">klist</w:t>
+      </w:r>
+      <w:r>
+        <w:t xml:space="preserve"> in </w:t>
+      </w:r>
+      <w:r>
+        <w:rPr>
+          <w:rStyle w:val="CodeChar"/>
+        </w:rPr>
+        <w:t xml:space="preserve">jdoe</w:t>
+      </w:r>
+      <w:r>
+        <w:t xml:space="preserve">'s session every minute: the expiry time moves forward on each pass. Put the values back to </w:t>
+      </w:r>
+      <w:r>
+        <w:rPr>
+          <w:rStyle w:val="CodeChar"/>
+        </w:rPr>
+        <w:t xml:space="preserve">1h</w:t>
+      </w:r>
+      <w:r>
+        <w:t xml:space="preserve"> and </w:t>
+      </w:r>
+      <w:r>
+        <w:rPr>
+          <w:rStyle w:val="CodeChar"/>
+        </w:rPr>
+        <w:t xml:space="preserve">5m</w:t>
+      </w:r>
+      <w:r>
+        <w:t xml:space="preserve"> afterwards.</w:t>
+      </w:r>
+    </w:p>
+    <w:p>
+      <w:pPr>
+        <w:pStyle w:val="Heading3"/>
+      </w:pPr>
+      <w:r>
+        <w:t xml:space="preserve">Tests of the safety controls (2.3.0)</w:t>
       </w:r>
     </w:p>
     <w:p>
@@ -7692,7 +7962,7 @@
         <w:rPr>
           <w:b/>
         </w:rPr>
-        <w:t xml:space="preserve">12. The kill switch stops issuance at once.</w:t>
+        <w:t xml:space="preserve">11. Users can see their own status.</w:t>
       </w:r>
     </w:p>
     <w:p>
@@ -7701,6 +7971,37 @@
       </w:pPr>
       <w:bookmarkStart w:id="60" w:name="bongo_lang_bash_60"/>
       <w:bookmarkEnd w:id="60"/>
+      <w:r>
+        <w:t xml:space="preserve">krb-get --status                                 # as jdoe</w:t>
+        <w:br/>
+        <w:t xml:space="preserve"># enrolled:        True</w:t>
+        <w:br/>
+        <w:t xml:space="preserve"># tickets expire:  2026-10-11 07:02 (in 9h41m)</w:t>
+        <w:br/>
+        <w:t xml:space="preserve">ssh ptest@hpclogin01.test.lab 'krb-get --status'</w:t>
+        <w:br/>
+        <w:t xml:space="preserve"># enrolled:        True</w:t>
+        <w:br/>
+        <w:t xml:space="preserve"># tickets expire:  -</w:t>
+        <w:br/>
+        <w:t xml:space="preserve"># last error:      your account cannot be delegated to the HPC services; contact the HPC admins (at ...)</w:t>
+      </w:r>
+    </w:p>
+    <w:p>
+      <w:pPr/>
+      <w:r>
+        <w:rPr>
+          <w:b/>
+        </w:rPr>
+        <w:t xml:space="preserve">12. The kill switch stops issuance at once.</w:t>
+      </w:r>
+    </w:p>
+    <w:p>
+      <w:pPr>
+        <w:pStyle w:val="Code"/>
+      </w:pPr>
+      <w:bookmarkStart w:id="61" w:name="bongo_lang_bash_61"/>
+      <w:bookmarkEnd w:id="61"/>
       <w:r>
         <w:t xml:space="preserve">sudo touch /etc/krb-hpc/disabled</w:t>
         <w:br/>
@@ -9859,8 +10160,8 @@
       <w:pPr>
         <w:pStyle w:val="Code"/>
       </w:pPr>
-      <w:bookmarkStart w:id="61" w:name="bongo_lang_bash_61"/>
-      <w:bookmarkEnd w:id="61"/>
+      <w:bookmarkStart w:id="62" w:name="bongo_lang_bash_62"/>
+      <w:bookmarkEnd w:id="62"/>
       <w:r>
         <w:t xml:space="preserve"># hpclogin01</w:t>
         <w:br/>
@@ -9944,7 +10245,7 @@
         <w:pStyle w:val="ListParagraph"/>
         <w:numPr>
           <w:ilvl w:val="0"/>
-          <w:numId w:val="5"/>
+          <w:numId w:val="6"/>
         </w:numPr>
       </w:pPr>
       <w:r>
@@ -9956,7 +10257,7 @@
         <w:pStyle w:val="ListParagraph"/>
         <w:numPr>
           <w:ilvl w:val="0"/>
-          <w:numId w:val="5"/>
+          <w:numId w:val="6"/>
         </w:numPr>
       </w:pPr>
       <w:r>
@@ -9986,7 +10287,7 @@
         <w:pStyle w:val="ListParagraph"/>
         <w:numPr>
           <w:ilvl w:val="0"/>
-          <w:numId w:val="5"/>
+          <w:numId w:val="6"/>
         </w:numPr>
       </w:pPr>
       <w:r>
@@ -10034,7 +10335,7 @@
         <w:pStyle w:val="ListParagraph"/>
         <w:numPr>
           <w:ilvl w:val="0"/>
-          <w:numId w:val="5"/>
+          <w:numId w:val="6"/>
         </w:numPr>
       </w:pPr>
       <w:r>
@@ -10082,7 +10383,7 @@
         <w:pStyle w:val="ListParagraph"/>
         <w:numPr>
           <w:ilvl w:val="0"/>
-          <w:numId w:val="5"/>
+          <w:numId w:val="6"/>
         </w:numPr>
       </w:pPr>
       <w:r>
@@ -10121,7 +10422,7 @@
         <w:pStyle w:val="ListParagraph"/>
         <w:numPr>
           <w:ilvl w:val="0"/>
-          <w:numId w:val="5"/>
+          <w:numId w:val="6"/>
         </w:numPr>
       </w:pPr>
       <w:r>
@@ -10151,7 +10452,7 @@
         <w:pStyle w:val="ListParagraph"/>
         <w:numPr>
           <w:ilvl w:val="0"/>
-          <w:numId w:val="5"/>
+          <w:numId w:val="6"/>
         </w:numPr>
       </w:pPr>
       <w:r>
@@ -10172,7 +10473,7 @@
         <w:pStyle w:val="ListParagraph"/>
         <w:numPr>
           <w:ilvl w:val="0"/>
-          <w:numId w:val="5"/>
+          <w:numId w:val="6"/>
         </w:numPr>
       </w:pPr>
       <w:r>
@@ -10211,7 +10512,7 @@
         <w:pStyle w:val="ListParagraph"/>
         <w:numPr>
           <w:ilvl w:val="0"/>
-          <w:numId w:val="5"/>
+          <w:numId w:val="6"/>
         </w:numPr>
       </w:pPr>
       <w:r>
@@ -10241,7 +10542,7 @@
         <w:pStyle w:val="ListParagraph"/>
         <w:numPr>
           <w:ilvl w:val="0"/>
-          <w:numId w:val="5"/>
+          <w:numId w:val="6"/>
         </w:numPr>
       </w:pPr>
       <w:r>
@@ -10262,7 +10563,7 @@
         <w:pStyle w:val="ListParagraph"/>
         <w:numPr>
           <w:ilvl w:val="0"/>
-          <w:numId w:val="5"/>
+          <w:numId w:val="6"/>
         </w:numPr>
       </w:pPr>
       <w:r>
@@ -10292,7 +10593,7 @@
         <w:pStyle w:val="ListParagraph"/>
         <w:numPr>
           <w:ilvl w:val="0"/>
-          <w:numId w:val="5"/>
+          <w:numId w:val="6"/>
         </w:numPr>
       </w:pPr>
       <w:r>
@@ -10331,7 +10632,7 @@
         <w:pStyle w:val="ListParagraph"/>
         <w:numPr>
           <w:ilvl w:val="0"/>
-          <w:numId w:val="5"/>
+          <w:numId w:val="6"/>
         </w:numPr>
       </w:pPr>
       <w:r>
@@ -10370,7 +10671,7 @@
         <w:pStyle w:val="ListParagraph"/>
         <w:numPr>
           <w:ilvl w:val="0"/>
-          <w:numId w:val="5"/>
+          <w:numId w:val="6"/>
         </w:numPr>
       </w:pPr>
       <w:r>
@@ -10382,7 +10683,7 @@
         <w:pStyle w:val="ListParagraph"/>
         <w:numPr>
           <w:ilvl w:val="0"/>
-          <w:numId w:val="5"/>
+          <w:numId w:val="6"/>
         </w:numPr>
       </w:pPr>
       <w:r>
@@ -10403,7 +10704,7 @@
         <w:pStyle w:val="ListParagraph"/>
         <w:numPr>
           <w:ilvl w:val="0"/>
-          <w:numId w:val="5"/>
+          <w:numId w:val="6"/>
         </w:numPr>
       </w:pPr>
       <w:r>
@@ -10415,7 +10716,7 @@
         <w:pStyle w:val="ListParagraph"/>
         <w:numPr>
           <w:ilvl w:val="0"/>
-          <w:numId w:val="5"/>
+          <w:numId w:val="6"/>
         </w:numPr>
       </w:pPr>
       <w:r>
@@ -10429,6 +10730,27 @@
       </w:r>
       <w:r>
         <w:t xml:space="preserve"> checked for an enrolled and a refused user (12, tests 11 and 12)</w:t>
+      </w:r>
+    </w:p>
+    <w:p>
+      <w:pPr>
+        <w:pStyle w:val="ListParagraph"/>
+        <w:numPr>
+          <w:ilvl w:val="0"/>
+          <w:numId w:val="6"/>
+        </w:numPr>
+      </w:pPr>
+      <w:r>
+        <w:t xml:space="preserve">☐ </w:t>
+      </w:r>
+      <w:r>
+        <w:rPr>
+          <w:rStyle w:val="CodeChar"/>
+        </w:rPr>
+        <w:t xml:space="preserve">tests/verify-ad.sh</w:t>
+      </w:r>
+      <w:r>
+        <w:t xml:space="preserve"> report shows no FAIL; any WARN understood (12)</w:t>
       </w:r>
     </w:p>
     <w:sectPr>
@@ -10622,6 +10944,12 @@
     <w:abstractNumId w:val="0"/>
   </w:num>
   <w:num w:numId="5">
+    <w:abstractNumId w:val="1"/>
+    <w:lvlOverride w:ilvl="0">
+      <w:startOverride w:val="1"/>
+    </w:lvlOverride>
+  </w:num>
+  <w:num w:numId="6">
     <w:abstractNumId w:val="0"/>
   </w:num>
 </w:numbering>

</xml_diff>

<commit_message>
Docs: compute nodes reach AD only through SSSD, not 'no network path'
Runbook intro and section 10, and the CRAFT comparison, said compute
nodes never talk to AD for tickets / need no network path to AD. Jobs
never get tickets from AD, but the nodes are AD-joined: SSSD needs ports
88, 389 and 464 to the DC and authenticates its lookups with the node's
machine account. Reworded to say exactly that.

Co-Authored-By: Claude Opus 5.5 <noreply@anthropic.com>
Claude-Session: https://claude.ai/code/session_012YjsSdZjahJs9G5kNGUV6m
</commit_message>
<xml_diff>
--- a/docs/hpc-test-lab-setup-runbook.docx
+++ b/docs/hpc-test-lab-setup-runbook.docx
@@ -111,7 +111,7 @@
         <w:t xml:space="preserve">/home</w:t>
       </w:r>
       <w:r>
-        <w:t xml:space="preserve"> is NFS-shared, every compute node sees the same file, and the Slurm TaskProlog points each task at it. Compute nodes never ask the domain controller for tickets; they talk to it only through SSSD, to look up users.</w:t>
+        <w:t xml:space="preserve"> is NFS-shared, every compute node sees the same file, and the Slurm TaskProlog points each task at it. Jobs on compute nodes never ask the domain controller for tickets; they only use the service tickets the broker wrote to the shared home. The compute nodes' only traffic to the domain controller is SSSD's: user lookups, authenticated with each node's own machine account.</w:t>
       </w:r>
     </w:p>
     <w:p>
@@ -6546,7 +6546,7 @@
     <w:p>
       <w:pPr/>
       <w:r>
-        <w:t xml:space="preserve">Compute nodes need no daemon, keytab or network path to AD: only </w:t>
+        <w:t xml:space="preserve">Compute nodes need no krb-credd daemon, no broker keytab and no krb-get. Their only traffic to AD is SSSD's (ports 88, 389 and 464 to dc01, section 4), for user lookups under the node's machine account. For the jobs' Kerberos they need only </w:t>
       </w:r>
       <w:r>
         <w:rPr>

</xml_diff>